<commit_message>
presentation + report fix
</commit_message>
<xml_diff>
--- a/Документация/Отчет.docx
+++ b/Документация/Отчет.docx
@@ -2066,6 +2066,9 @@
     </w:p>
     <w:p>
       <w:pPr>
+        <w:tabs>
+          <w:tab w:val="left" w:pos="5529"/>
+        </w:tabs>
         <w:spacing w:line="360" w:lineRule="auto"/>
         <w:jc w:val="center"/>
         <w:rPr>
@@ -2078,9 +2081,9 @@
           <w:noProof/>
         </w:rPr>
         <w:drawing>
-          <wp:inline distT="0" distB="0" distL="0" distR="0" wp14:anchorId="5267E640" wp14:editId="7AAEBF3F">
+          <wp:inline distT="0" distB="0" distL="0" distR="0" wp14:anchorId="5267E640" wp14:editId="744FF98A">
             <wp:extent cx="1358495" cy="2614246"/>
-            <wp:effectExtent l="0" t="0" r="0" b="0"/>
+            <wp:effectExtent l="19050" t="19050" r="13335" b="15240"/>
             <wp:docPr id="1" name="Рисунок 1"/>
             <wp:cNvGraphicFramePr>
               <a:graphicFrameLocks xmlns:a="http://schemas.openxmlformats.org/drawingml/2006/main" noChangeAspect="1"/>
@@ -2106,6 +2109,11 @@
                     <a:prstGeom prst="rect">
                       <a:avLst/>
                     </a:prstGeom>
+                    <a:ln w="12700">
+                      <a:solidFill>
+                        <a:schemeClr val="tx1"/>
+                      </a:solidFill>
+                    </a:ln>
                   </pic:spPr>
                 </pic:pic>
               </a:graphicData>
@@ -2239,9 +2247,9 @@
           <w:noProof/>
         </w:rPr>
         <w:drawing>
-          <wp:inline distT="0" distB="0" distL="0" distR="0" wp14:anchorId="22F9EF31" wp14:editId="2F4F175E">
+          <wp:inline distT="0" distB="0" distL="0" distR="0" wp14:anchorId="22F9EF31" wp14:editId="3B89BD99">
             <wp:extent cx="2192215" cy="2251465"/>
-            <wp:effectExtent l="0" t="0" r="0" b="0"/>
+            <wp:effectExtent l="19050" t="19050" r="17780" b="15875"/>
             <wp:docPr id="2" name="Рисунок 2"/>
             <wp:cNvGraphicFramePr>
               <a:graphicFrameLocks xmlns:a="http://schemas.openxmlformats.org/drawingml/2006/main" noChangeAspect="1"/>
@@ -2267,6 +2275,11 @@
                     <a:prstGeom prst="rect">
                       <a:avLst/>
                     </a:prstGeom>
+                    <a:ln w="12700">
+                      <a:solidFill>
+                        <a:schemeClr val="tx1"/>
+                      </a:solidFill>
+                    </a:ln>
                   </pic:spPr>
                 </pic:pic>
               </a:graphicData>
@@ -2683,9 +2696,9 @@
           <w:noProof/>
         </w:rPr>
         <w:drawing>
-          <wp:inline distT="0" distB="0" distL="0" distR="0" wp14:anchorId="095121A1" wp14:editId="581E18B5">
+          <wp:inline distT="0" distB="0" distL="0" distR="0" wp14:anchorId="095121A1" wp14:editId="34B6BBDE">
             <wp:extent cx="2836984" cy="1687917"/>
-            <wp:effectExtent l="0" t="0" r="1905" b="7620"/>
+            <wp:effectExtent l="19050" t="19050" r="20955" b="26670"/>
             <wp:docPr id="3" name="Рисунок 3"/>
             <wp:cNvGraphicFramePr>
               <a:graphicFrameLocks xmlns:a="http://schemas.openxmlformats.org/drawingml/2006/main" noChangeAspect="1"/>
@@ -2721,8 +2734,10 @@
                       <a:avLst/>
                     </a:prstGeom>
                     <a:noFill/>
-                    <a:ln>
-                      <a:noFill/>
+                    <a:ln w="12700">
+                      <a:solidFill>
+                        <a:schemeClr val="tx1"/>
+                      </a:solidFill>
                     </a:ln>
                   </pic:spPr>
                 </pic:pic>
@@ -2926,9 +2941,9 @@
           <w:szCs w:val="28"/>
         </w:rPr>
         <w:drawing>
-          <wp:inline distT="0" distB="0" distL="0" distR="0" wp14:anchorId="73288A99" wp14:editId="4483A347">
+          <wp:inline distT="0" distB="0" distL="0" distR="0" wp14:anchorId="73288A99" wp14:editId="322D36D1">
             <wp:extent cx="3434861" cy="1179765"/>
-            <wp:effectExtent l="0" t="0" r="0" b="1905"/>
+            <wp:effectExtent l="19050" t="19050" r="13335" b="20955"/>
             <wp:docPr id="8" name="Рисунок 8"/>
             <wp:cNvGraphicFramePr>
               <a:graphicFrameLocks xmlns:a="http://schemas.openxmlformats.org/drawingml/2006/main" noChangeAspect="1"/>
@@ -2954,6 +2969,11 @@
                     <a:prstGeom prst="rect">
                       <a:avLst/>
                     </a:prstGeom>
+                    <a:ln w="12700">
+                      <a:solidFill>
+                        <a:schemeClr val="tx1"/>
+                      </a:solidFill>
+                    </a:ln>
                   </pic:spPr>
                 </pic:pic>
               </a:graphicData>
@@ -3173,9 +3193,9 @@
           <w:szCs w:val="28"/>
         </w:rPr>
         <w:drawing>
-          <wp:inline distT="0" distB="0" distL="0" distR="0" wp14:anchorId="7C42AC88" wp14:editId="43EFE098">
+          <wp:inline distT="0" distB="0" distL="0" distR="0" wp14:anchorId="7C42AC88" wp14:editId="67007A2F">
             <wp:extent cx="1330569" cy="1628087"/>
-            <wp:effectExtent l="0" t="0" r="3175" b="0"/>
+            <wp:effectExtent l="19050" t="19050" r="22225" b="10795"/>
             <wp:docPr id="9" name="Рисунок 9"/>
             <wp:cNvGraphicFramePr>
               <a:graphicFrameLocks xmlns:a="http://schemas.openxmlformats.org/drawingml/2006/main" noChangeAspect="1"/>
@@ -3201,6 +3221,11 @@
                     <a:prstGeom prst="rect">
                       <a:avLst/>
                     </a:prstGeom>
+                    <a:ln w="12700">
+                      <a:solidFill>
+                        <a:schemeClr val="tx1"/>
+                      </a:solidFill>
+                    </a:ln>
                   </pic:spPr>
                 </pic:pic>
               </a:graphicData>
@@ -3450,9 +3475,9 @@
         </w:rPr>
         <w:lastRenderedPageBreak/>
         <w:drawing>
-          <wp:inline distT="0" distB="0" distL="0" distR="0" wp14:anchorId="1B2F8E05" wp14:editId="61565939">
+          <wp:inline distT="0" distB="0" distL="0" distR="0" wp14:anchorId="1B2F8E05" wp14:editId="3DBCFAB8">
             <wp:extent cx="2532184" cy="1548424"/>
-            <wp:effectExtent l="0" t="0" r="1905" b="0"/>
+            <wp:effectExtent l="19050" t="19050" r="20955" b="13970"/>
             <wp:docPr id="5" name="Рисунок 5"/>
             <wp:cNvGraphicFramePr>
               <a:graphicFrameLocks xmlns:a="http://schemas.openxmlformats.org/drawingml/2006/main" noChangeAspect="1"/>
@@ -3478,6 +3503,11 @@
                     <a:prstGeom prst="rect">
                       <a:avLst/>
                     </a:prstGeom>
+                    <a:ln w="12700">
+                      <a:solidFill>
+                        <a:schemeClr val="tx1"/>
+                      </a:solidFill>
+                    </a:ln>
                   </pic:spPr>
                 </pic:pic>
               </a:graphicData>
@@ -4545,9 +4575,9 @@
         </w:rPr>
         <w:lastRenderedPageBreak/>
         <w:drawing>
-          <wp:inline distT="0" distB="0" distL="0" distR="0" wp14:anchorId="7D967883" wp14:editId="05ACFACC">
+          <wp:inline distT="0" distB="0" distL="0" distR="0" wp14:anchorId="7D967883" wp14:editId="3BDD3E38">
             <wp:extent cx="2772508" cy="883220"/>
-            <wp:effectExtent l="0" t="0" r="0" b="0"/>
+            <wp:effectExtent l="19050" t="19050" r="8890" b="12700"/>
             <wp:docPr id="7" name="Рисунок 7"/>
             <wp:cNvGraphicFramePr>
               <a:graphicFrameLocks xmlns:a="http://schemas.openxmlformats.org/drawingml/2006/main" noChangeAspect="1"/>
@@ -4573,6 +4603,11 @@
                     <a:prstGeom prst="rect">
                       <a:avLst/>
                     </a:prstGeom>
+                    <a:ln w="12700">
+                      <a:solidFill>
+                        <a:schemeClr val="tx1"/>
+                      </a:solidFill>
+                    </a:ln>
                   </pic:spPr>
                 </pic:pic>
               </a:graphicData>
@@ -5172,9 +5207,9 @@
           <w:szCs w:val="28"/>
         </w:rPr>
         <w:drawing>
-          <wp:inline distT="0" distB="0" distL="0" distR="0" wp14:anchorId="69232A50" wp14:editId="051B3EF8">
+          <wp:inline distT="0" distB="0" distL="0" distR="0" wp14:anchorId="69232A50" wp14:editId="602889D7">
             <wp:extent cx="3317631" cy="987681"/>
-            <wp:effectExtent l="0" t="0" r="0" b="3175"/>
+            <wp:effectExtent l="19050" t="19050" r="16510" b="22225"/>
             <wp:docPr id="6" name="Рисунок 6"/>
             <wp:cNvGraphicFramePr>
               <a:graphicFrameLocks xmlns:a="http://schemas.openxmlformats.org/drawingml/2006/main" noChangeAspect="1"/>
@@ -5200,6 +5235,11 @@
                     <a:prstGeom prst="rect">
                       <a:avLst/>
                     </a:prstGeom>
+                    <a:ln w="12700">
+                      <a:solidFill>
+                        <a:schemeClr val="tx1"/>
+                      </a:solidFill>
+                    </a:ln>
                   </pic:spPr>
                 </pic:pic>
               </a:graphicData>

</xml_diff>